<commit_message>
Hoja del lunes 21 y go/no-go: se cierran los tres pendientes
La hoja de una pagina queda sin un solo marcador y sigue cabiendo en una hoja.
El renglon del telefono dice la extension 7123 y que ese dia esta desviada al
celular de Gerardo, que es mejor que publicar el numero: el equipo marca igual
que siempre. El del padron a ZK dice Miguel o Angel, que aprenden a hacerlo el
viernes en la capacitacion.

En la seccion 9 del go/no-go se registra que Miguel SI acepto los riesgos de la
seccion 8, confirmado por Gerardo el 17-sep, con la propia salida a produccion
como constancia: decidio con esos riesgos sobre la mesa y el sistema abrio. No
hay firma en el documento y no se fabrica una a posteriori; se anota como
aceptacion verbal del responsable con la operacion del 14-sep como evidencia.
</commit_message>
<xml_diff>
--- a/Entregables/E8 - Manual y Capacitacion/E8 - Que cambio esta semana (15-17 sep).docx
+++ b/Entregables/E8 - Manual y Capacitacion/E8 - Que cambio esta semana (15-17 sep).docx
@@ -1663,7 +1663,7 @@
           <w:szCs w:val="20"/>
           <w:lang w:val="es-ES"/>
         </w:rPr>
-        <w:t>[PENDIENTE: Lidia o Ángel]</w:t>
+        <w:t>Miguel o Ángel</w:t>
       </w:r>
       <w:r>
         <w:rPr>
@@ -1673,7 +1673,7 @@
           <w:szCs w:val="20"/>
           <w:lang w:val="es-ES"/>
         </w:rPr>
-        <w:t xml:space="preserve">. Lo que no se pueda resolver en el momento: </w:t>
+        <w:t xml:space="preserve">, que aprenden a hacerlo el viernes. Lo que no se pueda resolver en el momento: </w:t>
       </w:r>
       <w:r>
         <w:rPr>
@@ -1693,7 +1693,7 @@
           <w:szCs w:val="20"/>
           <w:lang w:val="es-ES"/>
         </w:rPr>
-        <w:t xml:space="preserve">, en la Ciudad de México, </w:t>
+        <w:t xml:space="preserve">, a su </w:t>
       </w:r>
       <w:r>
         <w:rPr>
@@ -1703,7 +1703,7 @@
           <w:szCs w:val="20"/>
           <w:lang w:val="es-ES"/>
         </w:rPr>
-        <w:t>[PENDIENTE: celular]</w:t>
+        <w:t>ext. 7123</w:t>
       </w:r>
       <w:r>
         <w:rPr>
@@ -1713,7 +1713,7 @@
           <w:szCs w:val="20"/>
           <w:lang w:val="es-ES"/>
         </w:rPr>
-        <w:t xml:space="preserve">. </w:t>
+        <w:t xml:space="preserve">, que ese día está desviada a su celular: marque igual que siempre. </w:t>
       </w:r>
       <w:r>
         <w:rPr>

</xml_diff>

<commit_message>
Hoja del lunes 21: sin capacitacion, el padron a ZK se exporta el miercoles
El equipo no se pudo juntar el viernes, asi que Miguel y Angel no practicaron el
export a ZK antes del lunes, que era lo que la hoja decia. Se cambia por la
regla que sale de revisar que se rompe si nadie exporta: un TAG de la escuela
ya abre desde que el stock se activo en ZK, y sin export abre de mas, no de
menos; el que NO abre es el TAG propio de la familia, porque no esta en ZK. Por
eso el lunes no se exporta el padron, y a la familia que llegue con su TAG se le
cobra y se le cita para el miercoles.

Tambien se corrige que el regreso es el MIERCOLES, no el martes: el laboratorio
es lunes y martes. Gerardo lo habia corregido a mano en el .docx, y en esa misma
edicion se habia perdido medio renglon («El lunes 21, sin Sistemas en sitio.»
quedo como «El lunes 2.»). Su correccion se lleva al .md y el renglon roto se
restaura; el .docx se regenera desde el .md y sigue cabiendo en una pagina.
</commit_message>
<xml_diff>
--- a/Entregables/E8 - Manual y Capacitacion/E8 - Que cambio esta semana (15-17 sep).docx
+++ b/Entregables/E8 - Manual y Capacitacion/E8 - Que cambio esta semana (15-17 sep).docx
@@ -1653,7 +1653,28 @@
           <w:szCs w:val="20"/>
           <w:lang w:val="es-ES"/>
         </w:rPr>
-        <w:t xml:space="preserve">. Exportar el padrón a ZK al final del día y aplicar los niveles: </w:t>
+        <w:t xml:space="preserve">. </w:t>
+      </w:r>
+      <w:r>
+        <w:rPr>
+          <w:rFonts w:ascii="Segoe UI" w:hAnsi="Segoe UI" w:cs="Segoe UI"/>
+          <w:color w:val="1C2333"/>
+          <w:sz w:val="20"/>
+          <w:szCs w:val="20"/>
+          <w:highlight w:val="yellow"/>
+          <w:lang w:val="es-ES"/>
+        </w:rPr>
+        <w:t>Ese día NO se exporta el padrón a ZK:</w:t>
+      </w:r>
+      <w:r>
+        <w:rPr>
+          <w:rFonts w:ascii="Segoe UI" w:hAnsi="Segoe UI" w:cs="Segoe UI"/>
+          <w:color w:val="1C2333"/>
+          <w:sz w:val="20"/>
+          <w:szCs w:val="20"/>
+          <w:lang w:val="es-ES"/>
+        </w:rPr>
+        <w:t xml:space="preserve"> se hace el miércoles. Los TAGs de la escuela ya abren desde el stock. </w:t>
       </w:r>
       <w:r>
         <w:rPr>
@@ -1663,7 +1684,7 @@
           <w:szCs w:val="20"/>
           <w:lang w:val="es-ES"/>
         </w:rPr>
-        <w:t>Miguel o Ángel</w:t>
+        <w:t>Si una familia trae su propio TAG, se cobra y se cita para el miércoles</w:t>
       </w:r>
       <w:r>
         <w:rPr>
@@ -1673,7 +1694,7 @@
           <w:szCs w:val="20"/>
           <w:lang w:val="es-ES"/>
         </w:rPr>
-        <w:t xml:space="preserve">, que aprenden a hacerlo el viernes. Lo que no se pueda resolver en el momento: </w:t>
+        <w:t xml:space="preserve">: un TAG propio no está en ZK y, pegado el lunes, no abriría. Lo que no se pueda resolver en el momento: </w:t>
       </w:r>
       <w:r>
         <w:rPr>
@@ -1713,7 +1734,7 @@
           <w:szCs w:val="20"/>
           <w:lang w:val="es-ES"/>
         </w:rPr>
-        <w:t xml:space="preserve">, que ese día está desviada a su celular: marque igual que siempre. </w:t>
+        <w:t xml:space="preserve">, desviada a su celular. </w:t>
       </w:r>
       <w:r>
         <w:rPr>
@@ -1724,7 +1745,7 @@
           <w:highlight w:val="yellow"/>
           <w:lang w:val="es-ES"/>
         </w:rPr>
-        <w:t>Ese día no se hace ningún cambio en el sistema:</w:t>
+        <w:t>Ese día no se hace ningún cambio en el sist</w:t>
       </w:r>
       <w:r>
         <w:rPr>
@@ -1732,9 +1753,20 @@
           <w:color w:val="1C2333"/>
           <w:sz w:val="20"/>
           <w:szCs w:val="20"/>
-          <w:lang w:val="es-ES"/>
-        </w:rPr>
-        <w:t xml:space="preserve"> si algo falla, se anota y se ve el martes.</w:t>
+          <w:highlight w:val="yellow"/>
+          <w:lang w:val="es-ES"/>
+        </w:rPr>
+        <w:t>ema:</w:t>
+      </w:r>
+      <w:r>
+        <w:rPr>
+          <w:rFonts w:ascii="Segoe UI" w:hAnsi="Segoe UI" w:cs="Segoe UI"/>
+          <w:color w:val="1C2333"/>
+          <w:sz w:val="20"/>
+          <w:szCs w:val="20"/>
+          <w:lang w:val="es-ES"/>
+        </w:rPr>
+        <w:t xml:space="preserve"> si algo falla, se anota y se ve el miércoles.</w:t>
       </w:r>
     </w:p>
     <w:sectPr>

</xml_diff>